<commit_message>
brief: five pillars as in the README, rubric totals 100, public tone
</commit_message>
<xml_diff>
--- a/PROJECT_BRIEF_th.docx
+++ b/PROJECT_BRIEF_th.docx
@@ -29,7 +29,7 @@
           <w:color w:val="1F3864"/>
           <w:sz w:val="46"/>
         </w:rPr>
-        <w:t>โจทย์โปรเจกต์กลุ่ม — Smart HMI สำหรับฟาร์มและโลจิสติกส์เกษตร</w:t>
+        <w:t>โจทย์โปรเจกต์ทีม — Smart HMI สำหรับฟาร์มและโลจิสติกส์เกษตร</w:t>
       </w:r>
     </w:p>
     <w:p>
@@ -47,7 +47,7 @@
           <w:b/>
           <w:i w:val="0"/>
         </w:rPr>
-        <w:t>หลักสูตร:</w:t>
+        <w:t>คอร์ส:</w:t>
       </w:r>
       <w:r>
         <w:rPr>
@@ -55,7 +55,7 @@
           <w:b w:val="0"/>
           <w:i w:val="0"/>
         </w:rPr>
-        <w:t xml:space="preserve"> AIoT for Smart Farm (Short Course 3 คาบ) · </w:t>
+        <w:t xml:space="preserve"> AIoT Development for Smart Farm — Intensive Course · </w:t>
       </w:r>
       <w:r>
         <w:rPr>
@@ -63,7 +63,7 @@
           <w:b/>
           <w:i w:val="0"/>
         </w:rPr>
-        <w:t>ผู้เรียน:</w:t>
+        <w:t>ทีม:</w:t>
       </w:r>
       <w:r>
         <w:rPr>
@@ -71,7 +71,7 @@
           <w:b w:val="0"/>
           <w:i w:val="0"/>
         </w:rPr>
-        <w:t xml:space="preserve"> 20 กลุ่ม × 2 คน · </w:t>
+        <w:t xml:space="preserve"> 2 คน · </w:t>
       </w:r>
       <w:r>
         <w:rPr>
@@ -87,7 +87,7 @@
           <w:b w:val="0"/>
           <w:i w:val="0"/>
         </w:rPr>
-        <w:t xml:space="preserve"> TESAIoT Dev Kit (firmware 2.4.1) กลุ่มละ 1 ตัว + BENTO Emulator</w:t>
+        <w:t xml:space="preserve"> TESAIoT Dev Kit ทีมละ 1 ตัว + BENTO Emulator</w:t>
       </w:r>
     </w:p>
     <w:p>
@@ -105,7 +105,7 @@
           <w:b w:val="0"/>
           <w:i w:val="0"/>
         </w:rPr>
-        <w:t xml:space="preserve"> 26 ต.ค. 13:00–16:00 · สาธิตบนบอร์ดจริง 5–7 นาที + ถาม-ตอบ</w:t>
+        <w:t xml:space="preserve"> 26 ต.ค. 13:00–16:00 · สาธิตบนบอร์ดจริง 5–6 นาที + ถาม-ตอบ 2 นาที</w:t>
       </w:r>
     </w:p>
     <w:p>
@@ -179,7 +179,7 @@
           <w:i/>
           <w:color w:val="5B616B"/>
         </w:rPr>
-        <w:t>แอปของกลุ่มเอง</w:t>
+        <w:t>แอปของทีมเอง</w:t>
       </w:r>
       <w:r>
         <w:rPr>
@@ -188,7 +188,7 @@
           <w:i/>
           <w:color w:val="5B616B"/>
         </w:rPr>
-        <w:t xml:space="preserve"> บนแล็ปท็อปที่รับข้อมูล เก็บ เตือน และสั่งกลับได้</w:t>
+        <w:t xml:space="preserve"> (เว็บหรือมือถือ) ที่รับข้อมูล เก็บ เตือน และสั่งกลับได้</w:t>
       </w:r>
       <w:r>
         <w:rPr>
@@ -251,7 +251,7 @@
           <w:i w:val="0"/>
           <w:color w:val="2E5496"/>
         </w:rPr>
-        <w:t>1. ห้าเสาของโปรเจกต์ (ขั้นต่ำที่ทุกกลุ่มต้องมี)</w:t>
+        <w:t>1. ห้าเสาของโปรเจกต์ (ขั้นต่ำที่ทุกทีมต้องมี)</w:t>
       </w:r>
     </w:p>
     <w:p>
@@ -278,7 +278,7 @@
           <w:b w:val="0"/>
           <w:i w:val="0"/>
         </w:rPr>
-        <w:t xml:space="preserve"> — คัดลอกแล้วเปลี่ยนเป็นเรื่องของกลุ่มได้เลย</w:t>
+        <w:t xml:space="preserve"> — คัดลอกแล้วเปลี่ยนเป็นเรื่องของทีมได้เลย</w:t>
       </w:r>
     </w:p>
     <w:tbl>
@@ -431,7 +431,7 @@
                 <w:b/>
                 <w:i w:val="0"/>
               </w:rPr>
-              <w:t>1 · HMI</w:t>
+              <w:t>1 · Smart HMI</w:t>
             </w:r>
             <w:r>
               <w:rPr>
@@ -439,7 +439,7 @@
                 <w:b w:val="0"/>
                 <w:i w:val="0"/>
               </w:rPr>
-              <w:t xml:space="preserve"> จอสัมผัสของบอร์ด</w:t>
+              <w:t xml:space="preserve"> จอสัมผัส + จอไฟ RGB</w:t>
             </w:r>
           </w:p>
         </w:tc>
@@ -468,7 +468,15 @@
                 <w:b w:val="0"/>
                 <w:i w:val="0"/>
               </w:rPr>
-              <w:t>หน้าจอเป็นเรื่องของกลุ่ม อ่านออกจากระยะหนึ่งเมตร มีป้ายสถานะ และมีการแตะอย่างน้อย 1 อย่าง (ปุ่มบนจอ) ที่ทำงานจริง</w:t>
+              <w:t xml:space="preserve">หน้าจอเป็นเรื่องของทีม อ่านออกจากระยะหนึ่งเมตร มีป้ายสถานะ และมีการแตะอย่างน้อย 1 อย่าง (ปุ่ม/สวิตช์/แท็บบนจอ) ที่ทำงานจริง · จอไฟ RGB บอกสถานะที่เห็นได้จากไกล วาด </w:t>
+            </w:r>
+            <w:r>
+              <w:rPr>
+                <w:rFonts w:ascii="TH Sarabun New" w:hAnsi="TH Sarabun New" w:cs="TH Sarabun New" w:eastAsia="TH Sarabun New"/>
+                <w:b/>
+                <w:i w:val="0"/>
+              </w:rPr>
+              <w:t>เฉพาะตอนสถานะเปลี่ยน</w:t>
             </w:r>
           </w:p>
         </w:tc>
@@ -499,6 +507,23 @@
                 <w:sz w:val="21"/>
               </w:rPr>
               <w:t>sf1_05</w:t>
+            </w:r>
+            <w:r>
+              <w:rPr>
+                <w:rFonts w:ascii="TH Sarabun New" w:hAnsi="TH Sarabun New" w:cs="TH Sarabun New" w:eastAsia="TH Sarabun New"/>
+                <w:b w:val="0"/>
+                <w:i w:val="0"/>
+              </w:rPr>
+              <w:t xml:space="preserve"> · </w:t>
+            </w:r>
+            <w:r>
+              <w:rPr>
+                <w:rFonts w:ascii="Consolas" w:hAnsi="Consolas" w:cs="Consolas" w:eastAsia="Consolas"/>
+                <w:b w:val="0"/>
+                <w:i w:val="0"/>
+                <w:sz w:val="21"/>
+              </w:rPr>
+              <w:t>sf3_01</w:t>
             </w:r>
             <w:r>
               <w:rPr>
@@ -550,7 +575,7 @@
                 <w:b/>
                 <w:i w:val="0"/>
               </w:rPr>
-              <w:t>2 · เซนเซอร์ + ค่าตั้ง</w:t>
+              <w:t>2 · เซนเซอร์</w:t>
             </w:r>
           </w:p>
         </w:tc>
@@ -580,7 +605,24 @@
                 <w:b w:val="0"/>
                 <w:i w:val="0"/>
               </w:rPr>
-              <w:t>เซนเซอร์จริงบนบอร์ดอย่างน้อย 1 ตัว (SHT40 · DPS368 · BMI270 · เรดาร์ · ไมค์) · ลูกบิด VR อย่างน้อย 1 ตัวเป็น "ค่าตั้ง" · ปุ่ม SW4/SW5 อย่างน้อย 1 ปุ่ม (จับขอบกดเอง) · กฎหรือ AI ที่มีตัวกันเตือนผิด (hysteresis / ยืนยัน N ครั้ง / นับในช่วงเวลา / ความมั่นใจขั้นต่ำ)</w:t>
+              <w:t xml:space="preserve">เซนเซอร์จริงบนบอร์ดอย่างน้อย 1 ตัว (SHT40 · DPS368 · BMI270 · เรดาร์ · ไมค์) · กฎหรือ AI ที่มีตัวกันเตือนผิด (hysteresis / ยืนยัน N ครั้ง / นับในช่วงเวลา / ความมั่นใจขั้นต่ำ) · ถ้าใช้ SHT40 ต้องตั้ง </w:t>
+            </w:r>
+            <w:r>
+              <w:rPr>
+                <w:rFonts w:ascii="Consolas" w:hAnsi="Consolas" w:cs="Consolas" w:eastAsia="Consolas"/>
+                <w:b w:val="0"/>
+                <w:i w:val="0"/>
+                <w:sz w:val="21"/>
+              </w:rPr>
+              <w:t>TEMP_OFFSET</w:t>
+            </w:r>
+            <w:r>
+              <w:rPr>
+                <w:rFonts w:ascii="TH Sarabun New" w:hAnsi="TH Sarabun New" w:cs="TH Sarabun New" w:eastAsia="TH Sarabun New"/>
+                <w:b w:val="0"/>
+                <w:i w:val="0"/>
+              </w:rPr>
+              <w:t xml:space="preserve"> เทียบกับเทอร์โมมิเตอร์</w:t>
             </w:r>
           </w:p>
         </w:tc>
@@ -611,7 +653,7 @@
                 <w:i w:val="0"/>
                 <w:sz w:val="21"/>
               </w:rPr>
-              <w:t>sf1_02</w:t>
+              <w:t>sf1_01</w:t>
             </w:r>
             <w:r>
               <w:rPr>
@@ -619,7 +661,7 @@
                 <w:b w:val="0"/>
                 <w:i w:val="0"/>
               </w:rPr>
-              <w:t xml:space="preserve"> </w:t>
+              <w:t>–</w:t>
             </w:r>
             <w:r>
               <w:rPr>
@@ -628,7 +670,7 @@
                 <w:i w:val="0"/>
                 <w:sz w:val="21"/>
               </w:rPr>
-              <w:t>sf1_03</w:t>
+              <w:t>sf1_04</w:t>
             </w:r>
             <w:r>
               <w:rPr>
@@ -636,24 +678,7 @@
                 <w:b w:val="0"/>
                 <w:i w:val="0"/>
               </w:rPr>
-              <w:t xml:space="preserve"> </w:t>
-            </w:r>
-            <w:r>
-              <w:rPr>
-                <w:rFonts w:ascii="Consolas" w:hAnsi="Consolas" w:cs="Consolas" w:eastAsia="Consolas"/>
-                <w:b w:val="0"/>
-                <w:i w:val="0"/>
-                <w:sz w:val="21"/>
-              </w:rPr>
-              <w:t>sf1_04</w:t>
-            </w:r>
-            <w:r>
-              <w:rPr>
-                <w:rFonts w:ascii="TH Sarabun New" w:hAnsi="TH Sarabun New" w:cs="TH Sarabun New" w:eastAsia="TH Sarabun New"/>
-                <w:b w:val="0"/>
-                <w:i w:val="0"/>
-              </w:rPr>
-              <w:t xml:space="preserve"> </w:t>
+              <w:t xml:space="preserve"> · </w:t>
             </w:r>
             <w:r>
               <w:rPr>
@@ -713,7 +738,7 @@
                 <w:b/>
                 <w:i w:val="0"/>
               </w:rPr>
-              <w:t>3 · เสียง + RGB matrix</w:t>
+              <w:t>3 · ปุ่มตั้งค่า</w:t>
             </w:r>
           </w:p>
         </w:tc>
@@ -742,31 +767,7 @@
                 <w:b w:val="0"/>
                 <w:i w:val="0"/>
               </w:rPr>
-              <w:t xml:space="preserve">เสียงอย่างน้อย 2 แบบ ดัง </w:t>
-            </w:r>
-            <w:r>
-              <w:rPr>
-                <w:rFonts w:ascii="TH Sarabun New" w:hAnsi="TH Sarabun New" w:cs="TH Sarabun New" w:eastAsia="TH Sarabun New"/>
-                <w:b/>
-                <w:i w:val="0"/>
-              </w:rPr>
-              <w:t>เฉพาะตอนเกิดเหตุการณ์</w:t>
-            </w:r>
-            <w:r>
-              <w:rPr>
-                <w:rFonts w:ascii="TH Sarabun New" w:hAnsi="TH Sarabun New" w:cs="TH Sarabun New" w:eastAsia="TH Sarabun New"/>
-                <w:b w:val="0"/>
-                <w:i w:val="0"/>
-              </w:rPr>
-              <w:t xml:space="preserve"> · RGB matrix บอกสถานะ วาด </w:t>
-            </w:r>
-            <w:r>
-              <w:rPr>
-                <w:rFonts w:ascii="TH Sarabun New" w:hAnsi="TH Sarabun New" w:cs="TH Sarabun New" w:eastAsia="TH Sarabun New"/>
-                <w:b/>
-                <w:i w:val="0"/>
-              </w:rPr>
-              <w:t>เฉพาะตอนสถานะเปลี่ยน</w:t>
+              <w:t>ลูกบิด VR อย่างน้อย 1 ตัวเป็น "ค่าตั้ง" ที่มีเหตุผล (เช่น เกณฑ์) · ปุ่ม SW5 (ล่าง) / SW6 (บน) อย่างน้อย 1 ปุ่มที่มีหน้าที่ชัด (เช่น รับทราบ · รดน้ำเอง · เริ่มเที่ยว)</w:t>
             </w:r>
           </w:p>
         </w:tc>
@@ -796,7 +797,7 @@
                 <w:i w:val="0"/>
                 <w:sz w:val="21"/>
               </w:rPr>
-              <w:t>sf3_01</w:t>
+              <w:t>sf1_03</w:t>
             </w:r>
             <w:r>
               <w:rPr>
@@ -804,7 +805,7 @@
                 <w:b w:val="0"/>
                 <w:i w:val="0"/>
               </w:rPr>
-              <w:t xml:space="preserve"> </w:t>
+              <w:t xml:space="preserve"> · </w:t>
             </w:r>
             <w:r>
               <w:rPr>
@@ -813,41 +814,7 @@
                 <w:i w:val="0"/>
                 <w:sz w:val="21"/>
               </w:rPr>
-              <w:t>sf3_02</w:t>
-            </w:r>
-            <w:r>
-              <w:rPr>
-                <w:rFonts w:ascii="TH Sarabun New" w:hAnsi="TH Sarabun New" w:cs="TH Sarabun New" w:eastAsia="TH Sarabun New"/>
-                <w:b w:val="0"/>
-                <w:i w:val="0"/>
-              </w:rPr>
-              <w:t xml:space="preserve"> </w:t>
-            </w:r>
-            <w:r>
-              <w:rPr>
-                <w:rFonts w:ascii="Consolas" w:hAnsi="Consolas" w:cs="Consolas" w:eastAsia="Consolas"/>
-                <w:b w:val="0"/>
-                <w:i w:val="0"/>
-                <w:sz w:val="21"/>
-              </w:rPr>
               <w:t>sf3_05</w:t>
-            </w:r>
-            <w:r>
-              <w:rPr>
-                <w:rFonts w:ascii="TH Sarabun New" w:hAnsi="TH Sarabun New" w:cs="TH Sarabun New" w:eastAsia="TH Sarabun New"/>
-                <w:b w:val="0"/>
-                <w:i w:val="0"/>
-              </w:rPr>
-              <w:t xml:space="preserve"> · </w:t>
-            </w:r>
-            <w:r>
-              <w:rPr>
-                <w:rFonts w:ascii="Consolas" w:hAnsi="Consolas" w:cs="Consolas" w:eastAsia="Consolas"/>
-                <w:b w:val="0"/>
-                <w:i w:val="0"/>
-                <w:sz w:val="21"/>
-              </w:rPr>
-              <w:t>sf2_03</w:t>
             </w:r>
           </w:p>
         </w:tc>
@@ -882,7 +849,7 @@
                 <w:b/>
                 <w:i w:val="0"/>
               </w:rPr>
-              <w:t>4 · MQTT ฝั่งบอร์ด</w:t>
+              <w:t>4 · เสียง</w:t>
             </w:r>
           </w:p>
         </w:tc>
@@ -912,58 +879,7 @@
                 <w:b w:val="0"/>
                 <w:i w:val="0"/>
               </w:rPr>
-              <w:t xml:space="preserve">ส่ง telemetry ขึ้น </w:t>
-            </w:r>
-            <w:r>
-              <w:rPr>
-                <w:rFonts w:ascii="Consolas" w:hAnsi="Consolas" w:cs="Consolas" w:eastAsia="Consolas"/>
-                <w:b w:val="0"/>
-                <w:i w:val="0"/>
-                <w:sz w:val="21"/>
-              </w:rPr>
-              <w:t>bento-aiot/&lt;TEAM&gt;/telemetry</w:t>
-            </w:r>
-            <w:r>
-              <w:rPr>
-                <w:rFonts w:ascii="TH Sarabun New" w:hAnsi="TH Sarabun New" w:cs="TH Sarabun New" w:eastAsia="TH Sarabun New"/>
-                <w:b w:val="0"/>
-                <w:i w:val="0"/>
-              </w:rPr>
-              <w:t xml:space="preserve"> ไม่ถี่กว่าทุก 5 วินาที · ส่ง event อย่างน้อย 1 ชนิดขึ้น </w:t>
-            </w:r>
-            <w:r>
-              <w:rPr>
-                <w:rFonts w:ascii="Consolas" w:hAnsi="Consolas" w:cs="Consolas" w:eastAsia="Consolas"/>
-                <w:b w:val="0"/>
-                <w:i w:val="0"/>
-                <w:sz w:val="21"/>
-              </w:rPr>
-              <w:t>.../event</w:t>
-            </w:r>
-            <w:r>
-              <w:rPr>
-                <w:rFonts w:ascii="TH Sarabun New" w:hAnsi="TH Sarabun New" w:cs="TH Sarabun New" w:eastAsia="TH Sarabun New"/>
-                <w:b w:val="0"/>
-                <w:i w:val="0"/>
-              </w:rPr>
-              <w:t xml:space="preserve"> · รับคำสั่งอย่างน้อย 1 ชนิดจาก </w:t>
-            </w:r>
-            <w:r>
-              <w:rPr>
-                <w:rFonts w:ascii="Consolas" w:hAnsi="Consolas" w:cs="Consolas" w:eastAsia="Consolas"/>
-                <w:b w:val="0"/>
-                <w:i w:val="0"/>
-                <w:sz w:val="21"/>
-              </w:rPr>
-              <w:t>.../cmd</w:t>
-            </w:r>
-            <w:r>
-              <w:rPr>
-                <w:rFonts w:ascii="TH Sarabun New" w:hAnsi="TH Sarabun New" w:cs="TH Sarabun New" w:eastAsia="TH Sarabun New"/>
-                <w:b w:val="0"/>
-                <w:i w:val="0"/>
-              </w:rPr>
-              <w:t xml:space="preserve"> · </w:t>
+              <w:t xml:space="preserve">เสียงอย่างน้อย 2 แบบ ต่างกันตามเหตุการณ์ ดัง </w:t>
             </w:r>
             <w:r>
               <w:rPr>
@@ -971,7 +887,7 @@
                 <w:b/>
                 <w:i w:val="0"/>
               </w:rPr>
-              <w:t>เน็ตหลุดแล้วบอร์ดยังตัดสินและเตือนได้</w:t>
+              <w:t>เฉพาะตอนเกิดเหตุการณ์</w:t>
             </w:r>
           </w:p>
         </w:tc>
@@ -1002,7 +918,7 @@
                 <w:i w:val="0"/>
                 <w:sz w:val="21"/>
               </w:rPr>
-              <w:t>sf2_02</w:t>
+              <w:t>sf1_02</w:t>
             </w:r>
             <w:r>
               <w:rPr>
@@ -1010,7 +926,7 @@
                 <w:b w:val="0"/>
                 <w:i w:val="0"/>
               </w:rPr>
-              <w:t xml:space="preserve"> </w:t>
+              <w:t xml:space="preserve"> · </w:t>
             </w:r>
             <w:r>
               <w:rPr>
@@ -1019,7 +935,7 @@
                 <w:i w:val="0"/>
                 <w:sz w:val="21"/>
               </w:rPr>
-              <w:t>sf2_03</w:t>
+              <w:t>sf3_02</w:t>
             </w:r>
             <w:r>
               <w:rPr>
@@ -1027,24 +943,7 @@
                 <w:b w:val="0"/>
                 <w:i w:val="0"/>
               </w:rPr>
-              <w:t xml:space="preserve"> </w:t>
-            </w:r>
-            <w:r>
-              <w:rPr>
-                <w:rFonts w:ascii="Consolas" w:hAnsi="Consolas" w:cs="Consolas" w:eastAsia="Consolas"/>
-                <w:b w:val="0"/>
-                <w:i w:val="0"/>
-                <w:sz w:val="21"/>
-              </w:rPr>
-              <w:t>sf2_04</w:t>
-            </w:r>
-            <w:r>
-              <w:rPr>
-                <w:rFonts w:ascii="TH Sarabun New" w:hAnsi="TH Sarabun New" w:cs="TH Sarabun New" w:eastAsia="TH Sarabun New"/>
-                <w:b w:val="0"/>
-                <w:i w:val="0"/>
-              </w:rPr>
-              <w:t xml:space="preserve"> </w:t>
+              <w:t xml:space="preserve"> · </w:t>
             </w:r>
             <w:r>
               <w:rPr>
@@ -1087,15 +986,7 @@
                 <w:b/>
                 <w:i w:val="0"/>
               </w:rPr>
-              <w:t>5 · แอปของกลุ่ม</w:t>
-            </w:r>
-            <w:r>
-              <w:rPr>
-                <w:rFonts w:ascii="TH Sarabun New" w:hAnsi="TH Sarabun New" w:cs="TH Sarabun New" w:eastAsia="TH Sarabun New"/>
-                <w:b w:val="0"/>
-                <w:i w:val="0"/>
-              </w:rPr>
-              <w:t xml:space="preserve"> บนแล็ปท็อป</w:t>
+              <w:t>5 · MQTT + แอปของตัวเอง</w:t>
             </w:r>
           </w:p>
         </w:tc>
@@ -1124,7 +1015,7 @@
                 <w:b w:val="0"/>
                 <w:i w:val="0"/>
               </w:rPr>
-              <w:t>ต่อยอดแอปจากคาบ 2 (</w:t>
+              <w:t xml:space="preserve">บอร์ดส่ง telemetry ขึ้น </w:t>
             </w:r>
             <w:r>
               <w:rPr>
@@ -1133,7 +1024,7 @@
                 <w:i w:val="0"/>
                 <w:sz w:val="21"/>
               </w:rPr>
-              <w:t>s2/app/farm_monitor.py</w:t>
+              <w:t>bento-aiot/&lt;TEAM&gt;/telemetry</w:t>
             </w:r>
             <w:r>
               <w:rPr>
@@ -1141,7 +1032,7 @@
                 <w:b w:val="0"/>
                 <w:i w:val="0"/>
               </w:rPr>
-              <w:t xml:space="preserve"> หรือ </w:t>
+              <w:t xml:space="preserve"> ไม่ถี่กว่าทุก 5 วินาที · ส่ง event อย่างน้อย 1 ชนิดขึ้น </w:t>
             </w:r>
             <w:r>
               <w:rPr>
@@ -1150,7 +1041,57 @@
                 <w:i w:val="0"/>
                 <w:sz w:val="21"/>
               </w:rPr>
-              <w:t>s2/app/farm_web.html</w:t>
+              <w:t>.../event</w:t>
+            </w:r>
+            <w:r>
+              <w:rPr>
+                <w:rFonts w:ascii="TH Sarabun New" w:hAnsi="TH Sarabun New" w:cs="TH Sarabun New" w:eastAsia="TH Sarabun New"/>
+                <w:b w:val="0"/>
+                <w:i w:val="0"/>
+              </w:rPr>
+              <w:t xml:space="preserve"> · รับคำสั่งอย่างน้อย 1 ชนิดจาก </w:t>
+            </w:r>
+            <w:r>
+              <w:rPr>
+                <w:rFonts w:ascii="Consolas" w:hAnsi="Consolas" w:cs="Consolas" w:eastAsia="Consolas"/>
+                <w:b w:val="0"/>
+                <w:i w:val="0"/>
+                <w:sz w:val="21"/>
+              </w:rPr>
+              <w:t>.../cmd</w:t>
+            </w:r>
+            <w:r>
+              <w:rPr>
+                <w:rFonts w:ascii="TH Sarabun New" w:hAnsi="TH Sarabun New" w:cs="TH Sarabun New" w:eastAsia="TH Sarabun New"/>
+                <w:b w:val="0"/>
+                <w:i w:val="0"/>
+              </w:rPr>
+              <w:t xml:space="preserve"> · </w:t>
+            </w:r>
+            <w:r>
+              <w:rPr>
+                <w:rFonts w:ascii="TH Sarabun New" w:hAnsi="TH Sarabun New" w:cs="TH Sarabun New" w:eastAsia="TH Sarabun New"/>
+                <w:b/>
+                <w:i w:val="0"/>
+              </w:rPr>
+              <w:t>เน็ตหลุดแล้วบอร์ดยังตัดสินและเตือนได้</w:t>
+            </w:r>
+            <w:r>
+              <w:rPr>
+                <w:rFonts w:ascii="TH Sarabun New" w:hAnsi="TH Sarabun New" w:cs="TH Sarabun New" w:eastAsia="TH Sarabun New"/>
+                <w:b w:val="0"/>
+                <w:i w:val="0"/>
+              </w:rPr>
+              <w:t xml:space="preserve"> · แอปของทีมต่อยอดจากคาบ 2 (</w:t>
+            </w:r>
+            <w:r>
+              <w:rPr>
+                <w:rFonts w:ascii="Consolas" w:hAnsi="Consolas" w:cs="Consolas" w:eastAsia="Consolas"/>
+                <w:b w:val="0"/>
+                <w:i w:val="0"/>
+                <w:sz w:val="21"/>
+              </w:rPr>
+              <w:t>s2/app/</w:t>
             </w:r>
             <w:r>
               <w:rPr>
@@ -1180,6 +1121,57 @@
               <w:rPr>
                 <w:rFonts w:ascii="TH Sarabun New" w:hAnsi="TH Sarabun New" w:cs="TH Sarabun New" w:eastAsia="TH Sarabun New"/>
               </w:rPr>
+            </w:r>
+            <w:r>
+              <w:rPr>
+                <w:rFonts w:ascii="Consolas" w:hAnsi="Consolas" w:cs="Consolas" w:eastAsia="Consolas"/>
+                <w:b w:val="0"/>
+                <w:i w:val="0"/>
+                <w:sz w:val="21"/>
+              </w:rPr>
+              <w:t>sf2_02</w:t>
+            </w:r>
+            <w:r>
+              <w:rPr>
+                <w:rFonts w:ascii="TH Sarabun New" w:hAnsi="TH Sarabun New" w:cs="TH Sarabun New" w:eastAsia="TH Sarabun New"/>
+                <w:b w:val="0"/>
+                <w:i w:val="0"/>
+              </w:rPr>
+              <w:t>–</w:t>
+            </w:r>
+            <w:r>
+              <w:rPr>
+                <w:rFonts w:ascii="Consolas" w:hAnsi="Consolas" w:cs="Consolas" w:eastAsia="Consolas"/>
+                <w:b w:val="0"/>
+                <w:i w:val="0"/>
+                <w:sz w:val="21"/>
+              </w:rPr>
+              <w:t>sf2_04</w:t>
+            </w:r>
+            <w:r>
+              <w:rPr>
+                <w:rFonts w:ascii="TH Sarabun New" w:hAnsi="TH Sarabun New" w:cs="TH Sarabun New" w:eastAsia="TH Sarabun New"/>
+                <w:b w:val="0"/>
+                <w:i w:val="0"/>
+              </w:rPr>
+              <w:t xml:space="preserve"> · </w:t>
+            </w:r>
+            <w:r>
+              <w:rPr>
+                <w:rFonts w:ascii="Consolas" w:hAnsi="Consolas" w:cs="Consolas" w:eastAsia="Consolas"/>
+                <w:b w:val="0"/>
+                <w:i w:val="0"/>
+                <w:sz w:val="21"/>
+              </w:rPr>
+              <w:t>sf3_05</w:t>
+            </w:r>
+            <w:r>
+              <w:rPr>
+                <w:rFonts w:ascii="TH Sarabun New" w:hAnsi="TH Sarabun New" w:cs="TH Sarabun New" w:eastAsia="TH Sarabun New"/>
+                <w:b w:val="0"/>
+                <w:i w:val="0"/>
+              </w:rPr>
+              <w:t xml:space="preserve"> · </w:t>
             </w:r>
             <w:r>
               <w:rPr>
@@ -1276,6 +1268,30 @@
         </w:rPr>
         <w:t>ฝึกจากท่ามือคน/เสียงทั่วไป ไม่ใช่ข้อมูลฟาร์มจริง</w:t>
       </w:r>
+      <w:r>
+        <w:rPr>
+          <w:rFonts w:ascii="TH Sarabun New" w:hAnsi="TH Sarabun New" w:cs="TH Sarabun New" w:eastAsia="TH Sarabun New"/>
+          <w:b w:val="0"/>
+          <w:i w:val="0"/>
+        </w:rPr>
+        <w:t xml:space="preserve"> · เรียกโมเดลด้วย </w:t>
+      </w:r>
+      <w:r>
+        <w:rPr>
+          <w:rFonts w:ascii="TH Sarabun New" w:hAnsi="TH Sarabun New" w:cs="TH Sarabun New" w:eastAsia="TH Sarabun New"/>
+          <w:b/>
+          <w:i w:val="0"/>
+        </w:rPr>
+        <w:t>ชื่อ</w:t>
+      </w:r>
+      <w:r>
+        <w:rPr>
+          <w:rFonts w:ascii="TH Sarabun New" w:hAnsi="TH Sarabun New" w:cs="TH Sarabun New" w:eastAsia="TH Sarabun New"/>
+          <w:b w:val="0"/>
+          <w:i w:val="0"/>
+        </w:rPr>
+        <w:t xml:space="preserve"> เท่านั้น</w:t>
+      </w:r>
     </w:p>
     <w:p>
       <w:pPr>
@@ -1328,6 +1344,36 @@
           <w:i w:val="0"/>
         </w:rPr>
         <w:t>ตัวเลขเกณฑ์ (อุณหภูมิ ความชื้น ฯลฯ) เป็นค่าสำหรับการเรียน ไม่ใช่คำแนะนำทางเกษตรกรรม ถ้าอ้างอิงค่าจริงให้บอกแหล่งที่มา</w:t>
+      </w:r>
+    </w:p>
+    <w:p>
+      <w:pPr>
+        <w:pStyle w:val="ListBullet"/>
+        <w:spacing w:after="60"/>
+      </w:pPr>
+      <w:r>
+        <w:rPr>
+          <w:rFonts w:ascii="TH Sarabun New" w:hAnsi="TH Sarabun New" w:cs="TH Sarabun New" w:eastAsia="TH Sarabun New"/>
+          <w:b w:val="0"/>
+          <w:i w:val="0"/>
+        </w:rPr>
+        <w:t xml:space="preserve">งานนี้เป็นต้นแบบเพื่อการเรียน </w:t>
+      </w:r>
+      <w:r>
+        <w:rPr>
+          <w:rFonts w:ascii="TH Sarabun New" w:hAnsi="TH Sarabun New" w:cs="TH Sarabun New" w:eastAsia="TH Sarabun New"/>
+          <w:b/>
+          <w:i w:val="0"/>
+        </w:rPr>
+        <w:t>ไม่ใช่อุปกรณ์ความปลอดภัยจริง</w:t>
+      </w:r>
+      <w:r>
+        <w:rPr>
+          <w:rFonts w:ascii="TH Sarabun New" w:hAnsi="TH Sarabun New" w:cs="TH Sarabun New" w:eastAsia="TH Sarabun New"/>
+          <w:b w:val="0"/>
+          <w:i w:val="0"/>
+        </w:rPr>
+        <w:t xml:space="preserve"> (โดยเฉพาะไอเดียที่เกี่ยวกับคนในพื้นที่อันตราย)</w:t>
       </w:r>
     </w:p>
     <w:p>
@@ -1551,6 +1597,31 @@
               </w:rPr>
               <w:t>.humidity()</w:t>
             </w:r>
+            <w:r>
+              <w:rPr>
+                <w:rFonts w:ascii="TH Sarabun New" w:hAnsi="TH Sarabun New" w:cs="TH Sarabun New" w:eastAsia="TH Sarabun New"/>
+                <w:b w:val="0"/>
+                <w:i w:val="0"/>
+              </w:rPr>
+              <w:t xml:space="preserve"> (ตั้ง </w:t>
+            </w:r>
+            <w:r>
+              <w:rPr>
+                <w:rFonts w:ascii="Consolas" w:hAnsi="Consolas" w:cs="Consolas" w:eastAsia="Consolas"/>
+                <w:b w:val="0"/>
+                <w:i w:val="0"/>
+                <w:sz w:val="21"/>
+              </w:rPr>
+              <w:t>TEMP_OFFSET</w:t>
+            </w:r>
+            <w:r>
+              <w:rPr>
+                <w:rFonts w:ascii="TH Sarabun New" w:hAnsi="TH Sarabun New" w:cs="TH Sarabun New" w:eastAsia="TH Sarabun New"/>
+                <w:b w:val="0"/>
+                <w:i w:val="0"/>
+              </w:rPr>
+              <w:t xml:space="preserve"> ก่อน)</w:t>
+            </w:r>
           </w:p>
         </w:tc>
         <w:tc>
@@ -1579,7 +1650,7 @@
                 <w:i w:val="0"/>
                 <w:sz w:val="21"/>
               </w:rPr>
-              <w:t>sf1_02</w:t>
+              <w:t>sf1_01</w:t>
             </w:r>
           </w:p>
         </w:tc>
@@ -2207,6 +2278,31 @@
               </w:rPr>
               <w:t>edge_ai.stop()</w:t>
             </w:r>
+            <w:r>
+              <w:rPr>
+                <w:rFonts w:ascii="TH Sarabun New" w:hAnsi="TH Sarabun New" w:cs="TH Sarabun New" w:eastAsia="TH Sarabun New"/>
+                <w:b w:val="0"/>
+                <w:i w:val="0"/>
+              </w:rPr>
+              <w:t xml:space="preserve"> — หาโมเดลด้วยชื่อ แล้วเก็บแค่ชื่อ ลำดับ และคลาส </w:t>
+            </w:r>
+            <w:r>
+              <w:rPr>
+                <w:rFonts w:ascii="TH Sarabun New" w:hAnsi="TH Sarabun New" w:cs="TH Sarabun New" w:eastAsia="TH Sarabun New"/>
+                <w:b/>
+                <w:i w:val="0"/>
+              </w:rPr>
+              <w:t xml:space="preserve">ห้ามพิมพ์ทั้งแถวของ </w:t>
+            </w:r>
+            <w:r>
+              <w:rPr>
+                <w:rFonts w:ascii="Consolas" w:hAnsi="Consolas" w:cs="Consolas" w:eastAsia="Consolas"/>
+                <w:b/>
+                <w:i w:val="0"/>
+                <w:sz w:val="21"/>
+              </w:rPr>
+              <w:t>edge_ai.models()</w:t>
+            </w:r>
           </w:p>
         </w:tc>
         <w:tc>
@@ -2390,7 +2486,7 @@
                 <w:b w:val="0"/>
                 <w:i w:val="0"/>
               </w:rPr>
-              <w:t>ปุ่ม SW4 / SW5</w:t>
+              <w:t>ปุ่ม SW5 (ล่าง) / SW6 (บน)</w:t>
             </w:r>
           </w:p>
         </w:tc>
@@ -2429,7 +2525,7 @@
                 <w:b w:val="0"/>
                 <w:i w:val="0"/>
               </w:rPr>
-              <w:t xml:space="preserve"> · </w:t>
+              <w:t xml:space="preserve"> = SW5 · </w:t>
             </w:r>
             <w:r>
               <w:rPr>
@@ -2446,7 +2542,7 @@
                 <w:b w:val="0"/>
                 <w:i w:val="0"/>
               </w:rPr>
-              <w:t xml:space="preserve"> · </w:t>
+              <w:t xml:space="preserve"> = SW6 · </w:t>
             </w:r>
             <w:r>
               <w:rPr>
@@ -2486,7 +2582,7 @@
                 <w:i w:val="0"/>
                 <w:sz w:val="21"/>
               </w:rPr>
-              <w:t>sf2_03</w:t>
+              <w:t>sf1_01</w:t>
             </w:r>
             <w:r>
               <w:rPr>
@@ -2503,7 +2599,7 @@
                 <w:i w:val="0"/>
                 <w:sz w:val="21"/>
               </w:rPr>
-              <w:t>sf3_01</w:t>
+              <w:t>sf3_05</w:t>
             </w:r>
           </w:p>
         </w:tc>
@@ -2673,7 +2769,7 @@
                 <w:i w:val="0"/>
                 <w:sz w:val="21"/>
               </w:rPr>
-              <w:t>sf3_01</w:t>
+              <w:t>sf1_01</w:t>
             </w:r>
             <w:r>
               <w:rPr>
@@ -2690,7 +2786,7 @@
                 <w:i w:val="0"/>
                 <w:sz w:val="21"/>
               </w:rPr>
-              <w:t>sf3_05</w:t>
+              <w:t>sf3_01</w:t>
             </w:r>
           </w:p>
         </w:tc>
@@ -2804,7 +2900,7 @@
                 <w:i w:val="0"/>
                 <w:sz w:val="21"/>
               </w:rPr>
-              <w:t>sf3_01</w:t>
+              <w:t>sf1_02</w:t>
             </w:r>
             <w:r>
               <w:rPr>
@@ -2821,7 +2917,7 @@
                 <w:i w:val="0"/>
                 <w:sz w:val="21"/>
               </w:rPr>
-              <w:t>sf2_03</w:t>
+              <w:t>sf3_02</w:t>
             </w:r>
           </w:p>
         </w:tc>
@@ -3026,7 +3122,24 @@
           <w:b w:val="0"/>
           <w:i w:val="0"/>
         </w:rPr>
-        <w:t xml:space="preserve"> ไมค์ได้ยินลำโพงบอร์ดตัวเอง (ปิดหูหลังส่งเสียง ดู </w:t>
+        <w:t xml:space="preserve"> SHT40 อ่านได้อุ่นกว่าห้อง (ชิปบนบอร์ดอุ่นตัวเอง) ต้องตั้ง </w:t>
+      </w:r>
+      <w:r>
+        <w:rPr>
+          <w:rFonts w:ascii="Consolas" w:hAnsi="Consolas" w:cs="Consolas" w:eastAsia="Consolas"/>
+          <w:b w:val="0"/>
+          <w:i w:val="0"/>
+          <w:sz w:val="21"/>
+        </w:rPr>
+        <w:t>TEMP_OFFSET</w:t>
+      </w:r>
+      <w:r>
+        <w:rPr>
+          <w:rFonts w:ascii="TH Sarabun New" w:hAnsi="TH Sarabun New" w:cs="TH Sarabun New" w:eastAsia="TH Sarabun New"/>
+          <w:b w:val="0"/>
+          <w:i w:val="0"/>
+        </w:rPr>
+        <w:t xml:space="preserve"> · ไมค์ได้ยินลำโพงบอร์ดตัวเอง (ปิดหูหลังส่งเสียง ดู </w:t>
       </w:r>
       <w:r>
         <w:rPr>
@@ -3060,7 +3173,41 @@
           <w:b w:val="0"/>
           <w:i w:val="0"/>
         </w:rPr>
-        <w:t>) · RGB matrix ทุกคำสั่งคือการเขียนบัสหนึ่งครั้ง ห้ามวาดทุกรอบลูป · ป้ายบนจอรับได้ 126 ไบต์ (ไทยตัวละ 3 ไบต์) · มุมขวาล่างของจอเป็นของปุ่ม Console อย่าวาง widget ทับ</w:t>
+        <w:t xml:space="preserve">) · RGB matrix ทุกคำสั่งคือการเขียนบัสหนึ่งครั้ง ห้ามวาดทุกรอบลูป · ป้ายบนจอรับได้ 126 ไบต์ (ไทยตัวละ 3 ไบต์) · มุมขวาล่างของจอเป็นของปุ่ม Console อย่าวาง widget ทับ · ไฟล์ยาวเกินหน่วยความจำ = </w:t>
+      </w:r>
+      <w:r>
+        <w:rPr>
+          <w:rFonts w:ascii="Consolas" w:hAnsi="Consolas" w:cs="Consolas" w:eastAsia="Consolas"/>
+          <w:b w:val="0"/>
+          <w:i w:val="0"/>
+          <w:sz w:val="21"/>
+        </w:rPr>
+        <w:t>MemoryError</w:t>
+      </w:r>
+      <w:r>
+        <w:rPr>
+          <w:rFonts w:ascii="TH Sarabun New" w:hAnsi="TH Sarabun New" w:cs="TH Sarabun New" w:eastAsia="TH Sarabun New"/>
+          <w:b w:val="0"/>
+          <w:i w:val="0"/>
+        </w:rPr>
+        <w:t xml:space="preserve"> ตอน import (ใช้ </w:t>
+      </w:r>
+      <w:r>
+        <w:rPr>
+          <w:rFonts w:ascii="Consolas" w:hAnsi="Consolas" w:cs="Consolas" w:eastAsia="Consolas"/>
+          <w:b w:val="0"/>
+          <w:i w:val="0"/>
+          <w:sz w:val="21"/>
+        </w:rPr>
+        <w:t>#</w:t>
+      </w:r>
+      <w:r>
+        <w:rPr>
+          <w:rFonts w:ascii="TH Sarabun New" w:hAnsi="TH Sarabun New" w:cs="TH Sarabun New" w:eastAsia="TH Sarabun New"/>
+          <w:b w:val="0"/>
+          <w:i w:val="0"/>
+        </w:rPr>
+        <w:t xml:space="preserve"> แทน docstring และเพิ่มทีละนิด)</w:t>
       </w:r>
     </w:p>
     <w:p>
@@ -3092,7 +3239,7 @@
           <w:b w:val="0"/>
           <w:i w:val="0"/>
         </w:rPr>
-        <w:t>แต่ละไอเดียควรมีไม่เกิน 3 กลุ่ม (ลงชื่อกับผู้สอนตอน Sprint 0 · ผู้สอนปรับได้) · กลุ่มที่เลือกไอเดียเดียวกันต้องแก้ปัญหาคนละมุม</w:t>
+        <w:t>แต่ละไอเดียมีได้ไม่เกิน 3 ทีม (ลงชื่อบนกระดานรวมตอน Sprint 0) · ทีมที่เลือกไอเดียเดียวกันต้องแก้ปัญหาคนละมุม</w:t>
       </w:r>
     </w:p>
     <w:tbl>
@@ -3439,7 +3586,7 @@
                 <w:b w:val="0"/>
                 <w:i w:val="0"/>
               </w:rPr>
-              <w:t>SHT40 + BMI270 กระแทก · VR3 = เกณฑ์อุณหภูมิ · SW4 = เริ่มเที่ยว · SW5 = รับทราบ</w:t>
+              <w:t>SHT40 + BMI270 กระแทก · VR3 = เกณฑ์อุณหภูมิ · SW5 = เริ่มเที่ยว · SW6 = รับทราบ</w:t>
             </w:r>
           </w:p>
         </w:tc>
@@ -3682,7 +3829,7 @@
                 <w:b w:val="0"/>
                 <w:i w:val="0"/>
               </w:rPr>
-              <w:t>BMI270 ถนนขรุขระ + SHT40 ในกระบะ · SW5 = "ส่งมอบแล้ว"</w:t>
+              <w:t>BMI270 ถนนขรุขระ + SHT40 ในกระบะ · SW6 = "ส่งมอบแล้ว"</w:t>
             </w:r>
           </w:p>
         </w:tc>
@@ -3898,7 +4045,7 @@
                 <w:b w:val="0"/>
                 <w:i w:val="0"/>
               </w:rPr>
-              <w:t>SHT40 + เรดาร์คนเข้าพื้นที่อับอากาศ · VR3 = เกณฑ์ความชื้น · SW4 = "มีคนเฝ้าปากไซโลแล้ว"</w:t>
+              <w:t>SHT40 + เรดาร์คนเข้าพื้นที่อับอากาศ · VR3 = เกณฑ์ความชื้น · SW5 = "มีคนเฝ้าปากไซโลแล้ว"</w:t>
             </w:r>
           </w:p>
         </w:tc>
@@ -3927,7 +4074,7 @@
                 <w:b w:val="0"/>
                 <w:i w:val="0"/>
               </w:rPr>
-              <w:t>เสียงเตือนเมื่อมีคนเข้าโดยไม่มีคนเฝ้า · แอปดูแนวโน้มความชื้นรายวัน</w:t>
+              <w:t>เสียงเตือนเมื่อมีคนเข้าโดยไม่มีคนเฝ้า · แอปดูแนวโน้มความชื้นรายวัน (ต้นแบบเพื่อการเรียน)</w:t>
             </w:r>
           </w:p>
         </w:tc>
@@ -4116,7 +4263,7 @@
                 <w:b w:val="0"/>
                 <w:i w:val="0"/>
               </w:rPr>
-              <w:t>SHT40 + DPS368 · VR2 = ดิน (จำลอง) · VR3 = เกณฑ์พัดลม · SW4 = รดเอง</w:t>
+              <w:t>SHT40 + DPS368 · VR2 = ดิน (จำลอง) · VR3 = เกณฑ์พัดลม · SW5 = รดเอง</w:t>
             </w:r>
           </w:p>
         </w:tc>
@@ -4349,7 +4496,7 @@
                 <w:b w:val="0"/>
                 <w:i w:val="0"/>
               </w:rPr>
-              <w:t>เรดาร์ + ไมค์ · VR3 = เขตคอก · SW4 = เปิด/ปิดระบบเฝ้า</w:t>
+              <w:t>เรดาร์ + ไมค์ · VR3 = เขตคอก · SW5 = เปิด/ปิดระบบเฝ้า</w:t>
             </w:r>
           </w:p>
         </w:tc>
@@ -4550,7 +4697,7 @@
                 <w:b w:val="0"/>
                 <w:i w:val="0"/>
               </w:rPr>
-              <w:t>VR4 = ระดับน้ำ (จำลอง) + BMI270 มุมเอียง · SW4 = หยุดฉุกเฉิน</w:t>
+              <w:t>VR4 = ระดับน้ำ (จำลอง) + BMI270 มุมเอียง · SW5 = หยุดฉุกเฉิน</w:t>
             </w:r>
           </w:p>
         </w:tc>
@@ -4774,7 +4921,7 @@
                 <w:b w:val="0"/>
                 <w:i w:val="0"/>
               </w:rPr>
-              <w:t>BMI270 ค่าสั่น (กฎ หรือ Edge AI) · SW4 = เรียนรู้ค่าปกติใหม่ · VR3 = ความไว</w:t>
+              <w:t>BMI270 ค่าสั่น (กฎ หรือ Edge AI) · SW5 = เรียนรู้ค่าปกติใหม่ · VR3 = ความไว</w:t>
             </w:r>
           </w:p>
         </w:tc>
@@ -4975,7 +5122,7 @@
                 <w:b w:val="0"/>
                 <w:i w:val="0"/>
               </w:rPr>
-              <w:t>ไมค์ + SHT40 · VR3 = เกณฑ์เสียง · SW5 = รับทราบ</w:t>
+              <w:t>ไมค์ + SHT40 · VR3 = เกณฑ์เสียง · SW6 = รับทราบ</w:t>
             </w:r>
           </w:p>
         </w:tc>
@@ -5297,7 +5444,7 @@
                 <w:b w:val="0"/>
                 <w:i w:val="0"/>
               </w:rPr>
-              <w:t>แอปของกลุ่มรับข้อมูลจากบอร์ดได้ และสั่งกลับได้ 1 คำสั่ง</w:t>
+              <w:t>แอปของทีมรับข้อมูลจากบอร์ดได้ และสั่งกลับได้ 1 คำสั่ง</w:t>
             </w:r>
           </w:p>
         </w:tc>
@@ -5360,7 +5507,7 @@
                 <w:b w:val="0"/>
                 <w:i w:val="0"/>
               </w:rPr>
-              <w:t>Project Canvas ผู้สอนเซ็นแล้ว · MVP บนบอร์ดรันได้อย่างน้อยเสา 1–3</w:t>
+              <w:t>Project Canvas ผ่านการตรวจของทีมข้าง ๆ หรือผู้ช่วยสอน · MVP บนบอร์ดรันได้อย่างน้อยเสา 1–4 (ส่วนที่อยู่บนบอร์ดทั้งหมด)</w:t>
             </w:r>
           </w:p>
         </w:tc>
@@ -5497,7 +5644,7 @@
                 <w:i w:val="0"/>
                 <w:sz w:val="21"/>
               </w:rPr>
-              <w:t>g&lt;เลขกลุ่ม&gt;_&lt;ชื่อ&gt;.py</w:t>
+              <w:t>g&lt;เลขทีม&gt;_&lt;ชื่อ&gt;.py</w:t>
             </w:r>
             <w:r>
               <w:rPr>
@@ -5618,7 +5765,7 @@
           <w:b w:val="0"/>
           <w:i w:val="0"/>
         </w:rPr>
-        <w:t xml:space="preserve"> 13:00–13:10 เปิดงาน · 13:10–15:50 นำเสนอ 20 กลุ่ม กลุ่มละ 8 นาที · 15:50–16:00 ปิดงาน</w:t>
+        <w:t xml:space="preserve"> 13:00–13:10 เปิดงาน · 13:10–15:50 นำเสนอทีมละ 8 นาที · 15:50–16:00 ปิดงาน</w:t>
       </w:r>
     </w:p>
     <w:p>
@@ -5628,7 +5775,7 @@
           <w:b/>
           <w:i w:val="0"/>
         </w:rPr>
-        <w:t>ช่อง 8 นาทีต่อกลุ่ม = สาธิต 5–6 นาที + ถาม-ตอบ 2 นาที</w:t>
+        <w:t>ช่อง 8 นาทีต่อทีม = สาธิต 5–6 นาที + ถาม-ตอบ 2 นาที</w:t>
       </w:r>
       <w:r>
         <w:rPr>
@@ -5636,7 +5783,7 @@
           <w:b w:val="0"/>
           <w:i w:val="0"/>
         </w:rPr>
-        <w:t xml:space="preserve"> · กริ่งเตือนที่ 6:00 · </w:t>
+        <w:t xml:space="preserve"> · กริ่งเตือนที่ 5:00 · </w:t>
       </w:r>
       <w:r>
         <w:rPr>
@@ -5644,7 +5791,7 @@
           <w:b/>
           <w:i w:val="0"/>
         </w:rPr>
-        <w:t>ตัดที่ 7:00</w:t>
+        <w:t>ตัดที่ 6:00</w:t>
       </w:r>
       <w:r>
         <w:rPr>
@@ -5652,27 +5799,7 @@
           <w:b w:val="0"/>
           <w:i w:val="0"/>
         </w:rPr>
-        <w:t xml:space="preserve"> (เวลาที่เกินหักจากช่วงถาม-ตอบ) · กลุ่มถัดไปต่อบอร์ด/Hotspot เตรียมไว้ระหว่างที่กลุ่มก่อนหน้าตอบคำถาม</w:t>
-      </w:r>
-    </w:p>
-    <w:p>
-      <w:pPr>
-        <w:keepLines/>
-        <w:pBdr>
-          <w:left w:val="single" w:sz="18" w:space="8" w:color="2E5496"/>
-        </w:pBdr>
-        <w:shd w:val="clear" w:fill="F1F5FB"/>
-        <w:spacing w:before="120" w:after="160" w:line="274" w:lineRule="auto"/>
-        <w:ind w:left="283" w:right="113"/>
-      </w:pPr>
-      <w:r>
-        <w:rPr>
-          <w:rFonts w:ascii="TH Sarabun New" w:hAnsi="TH Sarabun New" w:cs="TH Sarabun New" w:eastAsia="TH Sarabun New"/>
-          <w:b w:val="0"/>
-          <w:i/>
-          <w:color w:val="5B616B"/>
-        </w:rPr>
-        <w:t>คำนวณให้เห็น: 20 กลุ่ม × (7 นาที + ถาม-ตอบ 2 นาที) = 180 นาที เท่ากับเวลาทั้งบ่ายพอดี ไม่เหลือเวลาเปลี่ยนกลุ่มเลย จึงตั้งเป้าที่ 5–6 นาที และใช้ 7 นาทีเป็นเพดาน</w:t>
+        <w:t xml:space="preserve"> · ทีมถัดไปต่อบอร์ด/Hotspot เตรียมไว้ระหว่างที่ทีมก่อนหน้าตอบคำถาม (ไม่มีเวลาเปลี่ยนทีมแยกต่างหาก)</w:t>
       </w:r>
     </w:p>
     <w:p>
@@ -5866,7 +5993,7 @@
                 <w:b w:val="0"/>
                 <w:i w:val="0"/>
               </w:rPr>
-              <w:t>0:30–1:30</w:t>
+              <w:t>0:30–1:15</w:t>
             </w:r>
           </w:p>
         </w:tc>
@@ -5930,7 +6057,7 @@
                 <w:b w:val="0"/>
                 <w:i w:val="0"/>
               </w:rPr>
-              <w:t>1:30–4:30</w:t>
+              <w:t>1:15–4:15</w:t>
             </w:r>
           </w:p>
         </w:tc>
@@ -5967,7 +6094,7 @@
                 <w:b w:val="0"/>
                 <w:i w:val="0"/>
               </w:rPr>
-              <w:t xml:space="preserve"> สถานะปกติ → ทำให้เกิดเหตุ (เสียง + matrix + จอ) → กรณี "ไม่ควรเตือน" 1 ครั้ง → ปรับค่าตั้งด้วย VR หรือกด SW → แอปเห็น telemetry และ event → สั่งกลับจากแอปแล้วบอร์ดตอบสนอง</w:t>
+              <w:t xml:space="preserve"> สถานะปกติ → ทำให้เกิดเหตุ (เสียง + matrix + จอ) → กรณี "ไม่ควรเตือน" 1 ครั้ง → ปรับค่าตั้งด้วย VR หรือกด SW5/SW6 → แอปเห็น telemetry และ event → สั่งกลับจากแอปแล้วบอร์ดตอบสนอง</w:t>
             </w:r>
           </w:p>
         </w:tc>
@@ -6002,7 +6129,7 @@
                 <w:b w:val="0"/>
                 <w:i w:val="0"/>
               </w:rPr>
-              <w:t>4:30–5:30</w:t>
+              <w:t>4:15–5:15</w:t>
             </w:r>
           </w:p>
         </w:tc>
@@ -6066,7 +6193,7 @@
                 <w:b w:val="0"/>
                 <w:i w:val="0"/>
               </w:rPr>
-              <w:t>5:30–6:00</w:t>
+              <w:t>5:15–6:00</w:t>
             </w:r>
           </w:p>
         </w:tc>
@@ -6186,7 +6313,7 @@
           <w:b w:val="0"/>
           <w:i w:val="0"/>
         </w:rPr>
-        <w:t xml:space="preserve"> ใช้คลิปสำรองได้ แต่ช่อง "สาธิตสด" ในเกณฑ์ได้ไม่เกินครึ่ง · ถ้าเน็ตล่มทั้งห้อง ผู้สอนจะประเมินเสา 4–5 จากคลิปโดยไม่หักคะแนน</w:t>
+        <w:t xml:space="preserve"> ใช้คลิปสำรองได้ แต่หมวด "การนำเสนอ สาธิตสด และหลักฐานทดสอบ" ได้ไม่เกินครึ่ง · ถ้าเน็ตล่มทั้งห้อง ผู้สอนจะประเมินเสา 5 จากคลิปโดยไม่หักคะแนน</w:t>
       </w:r>
     </w:p>
     <w:p>
@@ -6578,7 +6705,7 @@
                 <w:b/>
                 <w:i w:val="0"/>
               </w:rPr>
-              <w:t>เสา 1 · HMI &amp; UX</w:t>
+              <w:t>เสา 1 · Smart HMI</w:t>
             </w:r>
           </w:p>
         </w:tc>
@@ -6638,7 +6765,7 @@
                 <w:b w:val="0"/>
                 <w:i w:val="0"/>
               </w:rPr>
-              <w:t>จออ่านง่ายจากหนึ่งเมตร สถานะชัด แตะแล้วตอบสนองทันที คนไม่เคยเห็นใช้เป็นใน 30 วินาที</w:t>
+              <w:t>จออ่านง่ายจากหนึ่งเมตร สถานะชัด แตะแล้วตอบสนองทันที คนไม่เคยเห็นใช้เป็นใน 30 วินาที · จอไฟ RGB สื่อสถานะจากไกล วาดเฉพาะตอนเปลี่ยน</w:t>
             </w:r>
           </w:p>
         </w:tc>
@@ -6668,7 +6795,7 @@
                 <w:b w:val="0"/>
                 <w:i w:val="0"/>
               </w:rPr>
-              <w:t>ใช้ได้แต่รก/ตัวเล็ก/ทับกัน หรือไม่มีการแตะที่มีความหมาย</w:t>
+              <w:t>ใช้ได้แต่รก/ตัวเล็ก/ทับกัน ไม่มีการแตะที่มีความหมาย หรือจอไฟ RGB วาดทุกรอบลูป</w:t>
             </w:r>
           </w:p>
         </w:tc>
@@ -6732,7 +6859,7 @@
                 <w:b/>
                 <w:i w:val="0"/>
               </w:rPr>
-              <w:t>เสา 2 · เซนเซอร์ ค่าตั้ง และการตัดสินใจ</w:t>
+              <w:t>เสา 2 · เซนเซอร์และการตัดสินใจ</w:t>
             </w:r>
           </w:p>
         </w:tc>
@@ -6761,7 +6888,7 @@
                 <w:b w:val="0"/>
                 <w:i w:val="0"/>
               </w:rPr>
-              <w:t>20</w:t>
+              <w:t>15</w:t>
             </w:r>
           </w:p>
         </w:tc>
@@ -6790,7 +6917,7 @@
                 <w:b w:val="0"/>
                 <w:i w:val="0"/>
               </w:rPr>
-              <w:t>เซนเซอร์จริงเหมาะกับปัญหา · VR/SW เป็นค่าตั้งที่มีเหตุผล · เกณฑ์มาจากค่าที่วัดเอง · มีตัวกันเตือนผิดและพิสูจน์ด้วยกรณี "ไม่ควรเตือน"</w:t>
+              <w:t>เซนเซอร์จริงเหมาะกับปัญหา · เกณฑ์มาจากค่าที่วัดเอง (ชดเชยแล้ว) · มีตัวกันเตือนผิดและพิสูจน์ด้วยกรณี "ไม่ควรเตือน"</w:t>
             </w:r>
           </w:p>
         </w:tc>
@@ -6883,7 +7010,7 @@
                 <w:b/>
                 <w:i w:val="0"/>
               </w:rPr>
-              <w:t>เสา 3 · เสียง + RGB matrix</w:t>
+              <w:t>เสา 3 · ปุ่มตั้งค่า</w:t>
             </w:r>
           </w:p>
         </w:tc>
@@ -6943,7 +7070,7 @@
                 <w:b w:val="0"/>
                 <w:i w:val="0"/>
               </w:rPr>
-              <w:t>เสียงต่างกันตามเหตุการณ์ ดังเฉพาะตอนเกิดเหตุ · matrix สื่อสถานะที่เห็นจากไกล · วาดเฉพาะตอนเปลี่ยน</w:t>
+              <w:t>VR เป็นค่าตั้งที่มีเหตุผลและเห็นค่าบนจอ · ปุ่ม SW5/SW6 มีหน้าที่ชัด กดสั้น ๆ ก็ไม่พลาด</w:t>
             </w:r>
           </w:p>
         </w:tc>
@@ -6973,7 +7100,7 @@
                 <w:b w:val="0"/>
                 <w:i w:val="0"/>
               </w:rPr>
-              <w:t>มีแต่ใช้ไม่สื่อความหมาย หรือดัง/วาดทุกรอบลูป</w:t>
+              <w:t>มีแต่ไม่บอกบนจอว่าตั้งอะไรไว้</w:t>
             </w:r>
           </w:p>
         </w:tc>
@@ -7037,7 +7164,7 @@
                 <w:b/>
                 <w:i w:val="0"/>
               </w:rPr>
-              <w:t>เสา 4 · MQTT ฝั่งบอร์ด</w:t>
+              <w:t>เสา 4 · เสียง</w:t>
             </w:r>
           </w:p>
         </w:tc>
@@ -7066,7 +7193,7 @@
                 <w:b w:val="0"/>
                 <w:i w:val="0"/>
               </w:rPr>
-              <w:t>15</w:t>
+              <w:t>10</w:t>
             </w:r>
           </w:p>
         </w:tc>
@@ -7095,7 +7222,7 @@
                 <w:b w:val="0"/>
                 <w:i w:val="0"/>
               </w:rPr>
-              <w:t>telemetry + event + cmd ครบ ฟิลด์ตั้งชื่อชัด · ความถี่เหมาะสม · เน็ตหลุดแล้วฟาร์มยังทำงาน</w:t>
+              <w:t>เสียงต่างกันตามเหตุการณ์ ดังเฉพาะตอนเกิดเหตุ ไม่ร้องรัว</w:t>
             </w:r>
           </w:p>
         </w:tc>
@@ -7124,7 +7251,7 @@
                 <w:b w:val="0"/>
                 <w:i w:val="0"/>
               </w:rPr>
-              <w:t>ส่งได้อย่างเดียว หรือรับคำสั่งไม่ตรวจค่า</w:t>
+              <w:t>มีเสียงเดียว หรือดังทุกรอบลูป</w:t>
             </w:r>
           </w:p>
         </w:tc>
@@ -7153,7 +7280,7 @@
                 <w:b w:val="0"/>
                 <w:i w:val="0"/>
               </w:rPr>
-              <w:t>ต่อ broker ไม่ได้ในวันนำเสนอ และไม่มีคลิป</w:t>
+              <w:t>ไม่มี</w:t>
             </w:r>
           </w:p>
         </w:tc>
@@ -7188,7 +7315,7 @@
                 <w:b/>
                 <w:i w:val="0"/>
               </w:rPr>
-              <w:t>เสา 5 · แอปของกลุ่ม</w:t>
+              <w:t>เสา 5 · MQTT + แอปของตัวเอง</w:t>
             </w:r>
           </w:p>
         </w:tc>
@@ -7218,7 +7345,7 @@
                 <w:b w:val="0"/>
                 <w:i w:val="0"/>
               </w:rPr>
-              <w:t>15</w:t>
+              <w:t>25</w:t>
             </w:r>
           </w:p>
         </w:tc>
@@ -7248,7 +7375,7 @@
                 <w:b w:val="0"/>
                 <w:i w:val="0"/>
               </w:rPr>
-              <w:t>ต่อยอดจากคาบ 2 อย่างมีความหมาย (CSV · กฎเตือนฝั่งแอป · สั่งกลับ) และรู้ว่าบอร์ดเงียบ</w:t>
+              <w:t>telemetry + event + cmd ครบ ฟิลด์ตั้งชื่อชัด ความถี่เหมาะสม เน็ตหลุดแล้วฟาร์มยังทำงาน · แอปต่อยอดจากคาบ 2 อย่างมีความหมาย (CSV · กฎเตือนฝั่งแอป · สั่งกลับ) และรู้ว่าบอร์ดเงียบ</w:t>
             </w:r>
           </w:p>
         </w:tc>
@@ -7278,7 +7405,7 @@
                 <w:b w:val="0"/>
                 <w:i w:val="0"/>
               </w:rPr>
-              <w:t>เพิ่มเล็กน้อย เช่น เปลี่ยนสี/ข้อความ</w:t>
+              <w:t>ส่งได้อย่างเดียว รับคำสั่งไม่ตรวจค่า หรือแอปเพิ่มแค่สี/ข้อความ</w:t>
             </w:r>
           </w:p>
         </w:tc>
@@ -7308,7 +7435,7 @@
                 <w:b w:val="0"/>
                 <w:i w:val="0"/>
               </w:rPr>
-              <w:t>ใช้แอปจากคาบ 2 โดยไม่แก้</w:t>
+              <w:t>ต่อ broker ไม่ได้ในวันนำเสนอและไม่มีคลิป หรือใช้แอปจากคาบ 2 โดยไม่แก้</w:t>
             </w:r>
           </w:p>
         </w:tc>
@@ -7635,7 +7762,7 @@
           <w:b w:val="0"/>
           <w:i w:val="0"/>
         </w:rPr>
-        <w:t>ใช้ Edge AI ไม่ได้คะแนนเพิ่มในตัวเอง — ได้คะแนนเมื่อกลุ่มแสดงด้วยตัวเลขว่ามันดีกว่ากฎสำหรับปัญหานั้น (หรือบอกได้ว่าทำไมกฎดีกว่า)</w:t>
+        <w:t>ใช้ Edge AI ไม่ได้คะแนนเพิ่มในตัวเอง — ได้คะแนนเมื่อทีมแสดงด้วยตัวเลขว่ามันดีกว่ากฎสำหรับปัญหานั้น (หรือบอกได้ว่าทำไมกฎดีกว่า)</w:t>
       </w:r>
     </w:p>
     <w:p>
@@ -7831,7 +7958,7 @@
         <w:color w:val="8A9099"/>
         <w:sz w:val="17"/>
       </w:rPr>
-      <w:t>โจทย์โปรเจกต์กลุ่ม — Smart HMI สำหรับฟาร์มและโลจิสติกส์เกษตร</w:t>
+      <w:t>โจทย์โปรเจกต์ทีม — Smart HMI สำหรับฟาร์มและโลจิสติกส์เกษตร</w:t>
     </w:r>
   </w:p>
 </w:hdr>

</xml_diff>

<commit_message>
session3: sound at 20 % through quiet tones, no calendar dates, worksheet and slides updated
</commit_message>
<xml_diff>
--- a/PROJECT_BRIEF_th.docx
+++ b/PROJECT_BRIEF_th.docx
@@ -105,7 +105,7 @@
           <w:b w:val="0"/>
           <w:i w:val="0"/>
         </w:rPr>
-        <w:t xml:space="preserve"> 26 ต.ค. 13:00–16:00 · สาธิตบนบอร์ดจริง 5–6 นาที + ถาม-ตอบ 2 นาที</w:t>
+        <w:t xml:space="preserve"> Project Showcase 13:00–16:00 · สาธิตบนบอร์ดจริง 5–6 นาที + ถาม-ตอบ 2 นาที</w:t>
       </w:r>
     </w:p>
     <w:p>
@@ -5350,7 +5350,7 @@
                 <w:b w:val="0"/>
                 <w:i w:val="0"/>
               </w:rPr>
-              <w:t>28 ก.ย. (คาบ 1)</w:t>
+              <w:t>Session 1</w:t>
             </w:r>
           </w:p>
         </w:tc>
@@ -5414,7 +5414,7 @@
                 <w:b w:val="0"/>
                 <w:i w:val="0"/>
               </w:rPr>
-              <w:t>5 ต.ค. (คาบ 2)</w:t>
+              <w:t>Session 2</w:t>
             </w:r>
           </w:p>
         </w:tc>
@@ -5478,7 +5478,7 @@
                 <w:b w:val="0"/>
                 <w:i w:val="0"/>
               </w:rPr>
-              <w:t>12 ต.ค. (คาบ 3)</w:t>
+              <w:t>Session 3</w:t>
             </w:r>
           </w:p>
         </w:tc>
@@ -5542,7 +5542,7 @@
                 <w:b w:val="0"/>
                 <w:i w:val="0"/>
               </w:rPr>
-              <w:t>13–25 ต.ค.</w:t>
+              <w:t>ระหว่าง Session 3 กับ Project Showcase</w:t>
             </w:r>
           </w:p>
         </w:tc>
@@ -5687,7 +5687,7 @@
                 <w:b w:val="0"/>
                 <w:i w:val="0"/>
               </w:rPr>
-              <w:t>26 ต.ค.</w:t>
+              <w:t>Project Showcase</w:t>
             </w:r>
           </w:p>
         </w:tc>
@@ -5747,7 +5747,7 @@
           <w:i w:val="0"/>
           <w:color w:val="2E5496"/>
         </w:rPr>
-        <w:t>5. รูปแบบการนำเสนอ 26 ต.ค.</w:t>
+        <w:t>5. รูปแบบการนำเสนอ (Project Showcase)</w:t>
       </w:r>
     </w:p>
     <w:p>

</xml_diff>

<commit_message>
slides: tidier part slides and group-size-neutral wording
</commit_message>
<xml_diff>
--- a/PROJECT_BRIEF_th.docx
+++ b/PROJECT_BRIEF_th.docx
@@ -56,22 +56,6 @@
           <w:i w:val="0"/>
         </w:rPr>
         <w:t xml:space="preserve"> AIoT Development for Smart Farm — Intensive Course · </w:t>
-      </w:r>
-      <w:r>
-        <w:rPr>
-          <w:rFonts w:ascii="TH Sarabun New" w:hAnsi="TH Sarabun New" w:cs="TH Sarabun New" w:eastAsia="TH Sarabun New"/>
-          <w:b/>
-          <w:i w:val="0"/>
-        </w:rPr>
-        <w:t>ทีม:</w:t>
-      </w:r>
-      <w:r>
-        <w:rPr>
-          <w:rFonts w:ascii="TH Sarabun New" w:hAnsi="TH Sarabun New" w:cs="TH Sarabun New" w:eastAsia="TH Sarabun New"/>
-          <w:b w:val="0"/>
-          <w:i w:val="0"/>
-        </w:rPr>
-        <w:t xml:space="preserve"> 2 คน · </w:t>
       </w:r>
       <w:r>
         <w:rPr>
@@ -5809,7 +5793,7 @@
           <w:b/>
           <w:i w:val="0"/>
         </w:rPr>
-        <w:t>ลำดับที่แนะนำ (ทั้งสองคนต้องได้พูด)</w:t>
+        <w:t>ลำดับที่แนะนำ (ทุกคนในทีมต้องได้พูด)</w:t>
       </w:r>
     </w:p>
     <w:tbl>
@@ -6287,7 +6271,7 @@
                 <w:b w:val="0"/>
                 <w:i w:val="0"/>
               </w:rPr>
-              <w:t>ถามทั้งสองคน อย่างน้อยหนึ่งคำถามเรื่องโค้ด</w:t>
+              <w:t>ถามทุกคนในทีม อย่างน้อยหนึ่งคำถามเรื่องโค้ด</w:t>
             </w:r>
           </w:p>
         </w:tc>
@@ -7527,7 +7511,7 @@
                 <w:b w:val="0"/>
                 <w:i w:val="0"/>
               </w:rPr>
-              <w:t>ตรงเวลา ทั้งสองคนพูดและตอบได้ · สาธิตสดครบตามลำดับ · ตารางทดสอบ ≥ 5 กรณีพร้อมตัวเลข</w:t>
+              <w:t>ตรงเวลา ทุกคนในทีมพูดและตอบได้ · สาธิตสดครบตามลำดับ · ตารางทดสอบ ≥ 5 กรณีพร้อมตัวเลข</w:t>
             </w:r>
           </w:p>
         </w:tc>
@@ -7556,7 +7540,7 @@
                 <w:b w:val="0"/>
                 <w:i w:val="0"/>
               </w:rPr>
-              <w:t>เกินเวลา หรือคนเดียวพูด หรือทดสอบน้อยกว่า 5 กรณี</w:t>
+              <w:t>เกินเวลา หรือมีคนในทีมไม่ได้พูด หรือทดสอบน้อยกว่า 5 กรณี</w:t>
             </w:r>
           </w:p>
         </w:tc>

</xml_diff>